<commit_message>
Fix Word-unopenable DOCX markup fixtures (fixture-only, no library change)
- NewSyntheticFixtures: w:delText to w:t inside w:moveFrom in review.docx
  (Word rejects delText as a direct moveFrom child; reader treats both
  identically, candidate text ops 25/25 identical).
- NewDocxMarkupCommentFixtures: correct commentsExtended content type
  (Word ground truth via COM: wordprocessingml.commentsExtended+xml) and
  minimal valid floating-textbox shape (locked, simplePos in schema order,
  docPr with name, cNvSpPr, prstGeom-only spPr, bare bodyPr; proven minimal
  by Word-COM bisection, candidate text ops 9/9 identical).
- NewDocxPrivateGroundedFixture: same content-type fix plus same textbox
  fix (candidate text ops 95/95 identical).
- All 23 public + 9 grounded docx-markup cases now render Office
  references live; suite 1071/0/0, Validate 319 (locked=51), private
  spec/deck MAE identical (8.476697/2.790301).
</commit_message>
<xml_diff>
--- a/tests/Lokad.OoxPdf.Tests/Cases/docx-markup-comment-text-box.docx
+++ b/tests/Lokad.OoxPdf.Tests/Cases/docx-markup-comment-text-box.docx
@@ -10,18 +10,26 @@
     <w:p>
       <w:r>
         <w:drawing>
-          <wp:anchor simplePos="0" relativeHeight="251658241" behindDoc="0" layoutInCell="1" allowOverlap="1">
-            <wp:extent cx="3200400" cy="1097280"/>
+          <wp:anchor simplePos="0" relativeHeight="251658241" behindDoc="0" locked="0" layoutInCell="1" allowOverlap="1">
+            <wp:simplePos x="0" y="0"/>
             <wp:positionH relativeFrom="page">
               <wp:posOffset>914400</wp:posOffset>
             </wp:positionH>
             <wp:positionV relativeFrom="page">
               <wp:posOffset>1828800</wp:posOffset>
             </wp:positionV>
+            <wp:extent cx="3200400" cy="1097280"/>
             <wp:wrapNone/>
+            <wp:docPr id="1" name="TextBox 1"/>
             <a:graphic>
               <a:graphicData uri="http://schemas.microsoft.com/office/word/2010/wordprocessingShape">
                 <wps:wsp>
+                  <wps:cNvSpPr txBox="1"/>
+                  <wps:spPr>
+                    <a:prstGeom prst="rect">
+                      <a:avLst/>
+                    </a:prstGeom>
+                  </wps:spPr>
                   <wps:txbx>
                     <w:txbxContent>
                       <w:p>
@@ -39,6 +47,7 @@
                       </w:p>
                     </w:txbxContent>
                   </wps:txbx>
+                  <wps:bodyPr/>
                 </wps:wsp>
               </a:graphicData>
             </a:graphic>

</xml_diff>